<commit_message>
Fix profile image path and update CV download path to Aniruddh Paralikar - AI Transformation CoE.docx
</commit_message>
<xml_diff>
--- a/public/Aniruddh Paralikar - AI Transformation CoE.docx
+++ b/public/Aniruddh Paralikar - AI Transformation CoE.docx
@@ -1,6 +1,6 @@
 
 <file path=word/document.xml><?xml version="1.0" encoding="utf-8"?>
-<w:document xmlns:wpc="http://schemas.microsoft.com/office/word/2010/wordprocessingCanvas" xmlns:cx="http://schemas.microsoft.com/office/drawing/2014/chartex" xmlns:cx1="http://schemas.microsoft.com/office/drawing/2015/9/8/chartex" xmlns:cx2="http://schemas.microsoft.com/office/drawing/2015/10/21/chartex" xmlns:cx3="http://schemas.microsoft.com/office/drawing/2016/5/9/chartex" xmlns:cx4="http://schemas.microsoft.com/office/drawing/2016/5/10/chartex" xmlns:cx5="http://schemas.microsoft.com/office/drawing/2016/5/11/chartex" xmlns:cx6="http://schemas.microsoft.com/office/drawing/2016/5/12/chartex" xmlns:cx7="http://schemas.microsoft.com/office/drawing/2016/5/13/chartex" xmlns:cx8="http://schemas.microsoft.com/office/drawing/2016/5/14/chartex" xmlns:mc="http://schemas.openxmlformats.org/markup-compatibility/2006" xmlns:aink="http://schemas.microsoft.com/office/drawing/2016/ink" xmlns:am3d="http://schemas.microsoft.com/office/drawing/2017/model3d" xmlns:o="urn:schemas-microsoft-com:office:office" xmlns:oel="http://schemas.microsoft.com/office/2019/extlst" xmlns:r="http://schemas.openxmlformats.org/officeDocument/2006/relationships" xmlns:m="http://schemas.openxmlformats.org/officeDocument/2006/math" xmlns:v="urn:schemas-microsoft-com:vml" xmlns:wp14="http://schemas.microsoft.com/office/word/2010/wordprocessingDrawing" xmlns:wp="http://schemas.openxmlformats.org/drawingml/2006/wordprocessingDrawing" xmlns:w10="urn:schemas-microsoft-com:office:word" xmlns:w="http://schemas.openxmlformats.org/wordprocessingml/2006/main" xmlns:w14="http://schemas.microsoft.com/office/word/2010/wordml" xmlns:w15="http://schemas.microsoft.com/office/word/2012/wordml" xmlns:w16cei="http://schemas.microsoft.com/office/word/2026/wordml/cei" xmlns:w16cex="http://schemas.microsoft.com/office/word/2018/wordml/cex" xmlns:w16cid="http://schemas.microsoft.com/office/word/2016/wordml/cid" xmlns:w16="http://schemas.microsoft.com/office/word/2018/wordml" xmlns:w16du="http://schemas.microsoft.com/office/word/2023/wordml/word16du" xmlns:w16sdtdh="http://schemas.microsoft.com/office/word/2020/wordml/sdtdatahash" xmlns:w16sdtfl="http://schemas.microsoft.com/office/word/2024/wordml/sdtformatlock" xmlns:w16se="http://schemas.microsoft.com/office/word/2015/wordml/symex" xmlns:wpg="http://schemas.microsoft.com/office/word/2010/wordprocessingGroup" xmlns:wpi="http://schemas.microsoft.com/office/word/2010/wordprocessingInk" xmlns:wne="http://schemas.microsoft.com/office/word/2006/wordml" xmlns:wps="http://schemas.microsoft.com/office/word/2010/wordprocessingShape" mc:Ignorable="w14 w15 w16se w16cid w16 w16cex w16sdtdh w16sdtfl w16du wp14">
+<w:document xmlns:wpc="http://schemas.microsoft.com/office/word/2010/wordprocessingCanvas" xmlns:cx="http://schemas.microsoft.com/office/drawing/2014/chartex" xmlns:cx1="http://schemas.microsoft.com/office/drawing/2015/9/8/chartex" xmlns:cx2="http://schemas.microsoft.com/office/drawing/2015/10/21/chartex" xmlns:cx3="http://schemas.microsoft.com/office/drawing/2016/5/9/chartex" xmlns:cx4="http://schemas.microsoft.com/office/drawing/2016/5/10/chartex" xmlns:cx5="http://schemas.microsoft.com/office/drawing/2016/5/11/chartex" xmlns:cx6="http://schemas.microsoft.com/office/drawing/2016/5/12/chartex" xmlns:cx7="http://schemas.microsoft.com/office/drawing/2016/5/13/chartex" xmlns:cx8="http://schemas.microsoft.com/office/drawing/2016/5/14/chartex" xmlns:mc="http://schemas.openxmlformats.org/markup-compatibility/2006" xmlns:aink="http://schemas.microsoft.com/office/drawing/2016/ink" xmlns:am3d="http://schemas.microsoft.com/office/drawing/2017/model3d" xmlns:o="urn:schemas-microsoft-com:office:office" xmlns:oel="http://schemas.microsoft.com/office/2019/extlst" xmlns:r="http://schemas.openxmlformats.org/officeDocument/2006/relationships" xmlns:m="http://schemas.openxmlformats.org/officeDocument/2006/math" xmlns:v="urn:schemas-microsoft-com:vml" xmlns:wp14="http://schemas.microsoft.com/office/word/2010/wordprocessingDrawing" xmlns:wp="http://schemas.openxmlformats.org/drawingml/2006/wordprocessingDrawing" xmlns:w10="urn:schemas-microsoft-com:office:word" xmlns:w="http://schemas.openxmlformats.org/wordprocessingml/2006/main" xmlns:w14="http://schemas.microsoft.com/office/word/2010/wordml" xmlns:w15="http://schemas.microsoft.com/office/word/2012/wordml" xmlns:w16cex="http://schemas.microsoft.com/office/word/2018/wordml/cex" xmlns:w16cid="http://schemas.microsoft.com/office/word/2016/wordml/cid" xmlns:w16="http://schemas.microsoft.com/office/word/2018/wordml" xmlns:w16du="http://schemas.microsoft.com/office/word/2023/wordml/word16du" xmlns:w16sdtdh="http://schemas.microsoft.com/office/word/2020/wordml/sdtdatahash" xmlns:w16sdtfl="http://schemas.microsoft.com/office/word/2024/wordml/sdtformatlock" xmlns:w16se="http://schemas.microsoft.com/office/word/2015/wordml/symex" xmlns:wpg="http://schemas.microsoft.com/office/word/2010/wordprocessingGroup" xmlns:wpi="http://schemas.microsoft.com/office/word/2010/wordprocessingInk" xmlns:wne="http://schemas.microsoft.com/office/word/2006/wordml" xmlns:wps="http://schemas.microsoft.com/office/word/2010/wordprocessingShape" mc:Ignorable="w14 w15 w16se w16cid w16 w16cex w16sdtdh w16sdtfl w16du wp14">
   <w:body>
     <w:p>
       <w:pPr>
@@ -42,28 +42,31 @@
           <w:color w:val="525252"/>
           <w:sz w:val="17"/>
         </w:rPr>
-        <w:t>Hyderabad, India  |  +91</w:t>
-      </w:r>
+        <w:t xml:space="preserve">Hyderabad, </w:t>
+      </w:r>
+      <w:proofErr w:type="gramStart"/>
       <w:r>
         <w:rPr>
           <w:color w:val="525252"/>
           <w:sz w:val="17"/>
         </w:rPr>
-        <w:t xml:space="preserve"> </w:t>
-      </w:r>
+        <w:t>India  |</w:t>
+      </w:r>
+      <w:proofErr w:type="gramEnd"/>
       <w:r>
         <w:rPr>
           <w:color w:val="525252"/>
           <w:sz w:val="17"/>
         </w:rPr>
-        <w:t>8898337348  |  aniruddh</w:t>
-      </w:r>
+        <w:t xml:space="preserve">  </w:t>
+      </w:r>
+      <w:proofErr w:type="gramStart"/>
       <w:r>
         <w:rPr>
           <w:color w:val="525252"/>
           <w:sz w:val="17"/>
         </w:rPr>
-        <w:t>123</w:t>
+        <w:t>connectwithaniruddh</w:t>
       </w:r>
       <w:r>
         <w:rPr>
@@ -84,7 +87,15 @@
           <w:color w:val="525252"/>
           <w:sz w:val="17"/>
         </w:rPr>
-        <w:t xml:space="preserve">  |  linkedin.com/in/aniruddhparalikar</w:t>
+        <w:t xml:space="preserve">  |</w:t>
+      </w:r>
+      <w:proofErr w:type="gramEnd"/>
+      <w:r>
+        <w:rPr>
+          <w:color w:val="525252"/>
+          <w:sz w:val="17"/>
+        </w:rPr>
+        <w:t xml:space="preserve">  linkedin.com/in/aniruddhparalikar</w:t>
       </w:r>
     </w:p>
     <w:p>
@@ -112,7 +123,19 @@
         <w:rPr>
           <w:color w:val="000000"/>
         </w:rPr>
-        <w:t xml:space="preserve">AI transformation and enterprise architecture leader with 15+ years of experience translating business strategy into scalable AI, data, automation, and operating-model change. </w:t>
+        <w:t>AI transformation and enterprise architecture leader with 1</w:t>
+      </w:r>
+      <w:r>
+        <w:rPr>
+          <w:color w:val="000000"/>
+        </w:rPr>
+        <w:t>6</w:t>
+      </w:r>
+      <w:r>
+        <w:rPr>
+          <w:color w:val="000000"/>
+        </w:rPr>
+        <w:t xml:space="preserve">+ years of experience translating business strategy into scalable AI, data, automation, and operating-model change. </w:t>
       </w:r>
       <w:r>
         <w:rPr>
@@ -226,7 +249,19 @@
         <w:rPr>
           <w:color w:val="000000"/>
         </w:rPr>
-        <w:t xml:space="preserve"> Helped CoE and GTM team for quick solutioning in a user friendly way.</w:t>
+        <w:t xml:space="preserve"> Helped CoE and GTM team for quick solutioning in a </w:t>
+      </w:r>
+      <w:r>
+        <w:rPr>
+          <w:color w:val="000000"/>
+        </w:rPr>
+        <w:t>user-friendly</w:t>
+      </w:r>
+      <w:r>
+        <w:rPr>
+          <w:color w:val="000000"/>
+        </w:rPr>
+        <w:t xml:space="preserve"> way.</w:t>
       </w:r>
     </w:p>
     <w:p>
@@ -497,7 +532,21 @@
         <w:rPr>
           <w:color w:val="000000"/>
         </w:rPr>
-        <w:t>Lead the AI &amp; Data CoE, defining enterprise AI strategy, governance, operating model, architecture standards, reusable assets, and adoption playbooks aligned with transformation priorities.</w:t>
+        <w:t xml:space="preserve">Lead the AI &amp; Data CoE, defining enterprise AI strategy, governance, operating </w:t>
+      </w:r>
+      <w:proofErr w:type="gramStart"/>
+      <w:r>
+        <w:rPr>
+          <w:color w:val="000000"/>
+        </w:rPr>
+        <w:t>model</w:t>
+      </w:r>
+      <w:proofErr w:type="gramEnd"/>
+      <w:r>
+        <w:rPr>
+          <w:color w:val="000000"/>
+        </w:rPr>
+        <w:t>, architecture standards, reusable assets, and adoption playbooks aligned with transformation priorities.</w:t>
       </w:r>
     </w:p>
     <w:p>
@@ -521,7 +570,21 @@
         <w:rPr>
           <w:color w:val="000000"/>
         </w:rPr>
-        <w:t>Direct transformation use cases across audit, FP&amp;A, O2C, P2P, and R2R, including invoice and vendor validation, terms recognition, tax and cover-sheet preparation, anomaly detection, and time-sheet integration.</w:t>
+        <w:t xml:space="preserve">Direct transformation </w:t>
+      </w:r>
+      <w:proofErr w:type="gramStart"/>
+      <w:r>
+        <w:rPr>
+          <w:color w:val="000000"/>
+        </w:rPr>
+        <w:t>use</w:t>
+      </w:r>
+      <w:proofErr w:type="gramEnd"/>
+      <w:r>
+        <w:rPr>
+          <w:color w:val="000000"/>
+        </w:rPr>
+        <w:t xml:space="preserve"> cases across audit, FP&amp;A, O2C, P2P, and R2R, including invoice and vendor validation, terms recognition, tax and cover-sheet preparation, anomaly detection, and time-sheet integration.</w:t>
       </w:r>
     </w:p>
     <w:p>
@@ -1105,7 +1168,7 @@
 </file>
 
 <file path=word/endnotes.xml><?xml version="1.0" encoding="utf-8"?>
-<w:endnotes xmlns:wpc="http://schemas.microsoft.com/office/word/2010/wordprocessingCanvas" xmlns:cx="http://schemas.microsoft.com/office/drawing/2014/chartex" xmlns:cx1="http://schemas.microsoft.com/office/drawing/2015/9/8/chartex" xmlns:cx2="http://schemas.microsoft.com/office/drawing/2015/10/21/chartex" xmlns:cx3="http://schemas.microsoft.com/office/drawing/2016/5/9/chartex" xmlns:cx4="http://schemas.microsoft.com/office/drawing/2016/5/10/chartex" xmlns:cx5="http://schemas.microsoft.com/office/drawing/2016/5/11/chartex" xmlns:cx6="http://schemas.microsoft.com/office/drawing/2016/5/12/chartex" xmlns:cx7="http://schemas.microsoft.com/office/drawing/2016/5/13/chartex" xmlns:cx8="http://schemas.microsoft.com/office/drawing/2016/5/14/chartex" xmlns:mc="http://schemas.openxmlformats.org/markup-compatibility/2006" xmlns:aink="http://schemas.microsoft.com/office/drawing/2016/ink" xmlns:am3d="http://schemas.microsoft.com/office/drawing/2017/model3d" xmlns:o="urn:schemas-microsoft-com:office:office" xmlns:oel="http://schemas.microsoft.com/office/2019/extlst" xmlns:r="http://schemas.openxmlformats.org/officeDocument/2006/relationships" xmlns:m="http://schemas.openxmlformats.org/officeDocument/2006/math" xmlns:v="urn:schemas-microsoft-com:vml" xmlns:wp14="http://schemas.microsoft.com/office/word/2010/wordprocessingDrawing" xmlns:wp="http://schemas.openxmlformats.org/drawingml/2006/wordprocessingDrawing" xmlns:w10="urn:schemas-microsoft-com:office:word" xmlns:w="http://schemas.openxmlformats.org/wordprocessingml/2006/main" xmlns:w14="http://schemas.microsoft.com/office/word/2010/wordml" xmlns:w15="http://schemas.microsoft.com/office/word/2012/wordml" xmlns:w16cei="http://schemas.microsoft.com/office/word/2026/wordml/cei" xmlns:w16cex="http://schemas.microsoft.com/office/word/2018/wordml/cex" xmlns:w16cid="http://schemas.microsoft.com/office/word/2016/wordml/cid" xmlns:w16="http://schemas.microsoft.com/office/word/2018/wordml" xmlns:w16du="http://schemas.microsoft.com/office/word/2023/wordml/word16du" xmlns:w16sdtdh="http://schemas.microsoft.com/office/word/2020/wordml/sdtdatahash" xmlns:w16sdtfl="http://schemas.microsoft.com/office/word/2024/wordml/sdtformatlock" xmlns:w16se="http://schemas.microsoft.com/office/word/2015/wordml/symex" xmlns:wpg="http://schemas.microsoft.com/office/word/2010/wordprocessingGroup" xmlns:wpi="http://schemas.microsoft.com/office/word/2010/wordprocessingInk" xmlns:wne="http://schemas.microsoft.com/office/word/2006/wordml" xmlns:wps="http://schemas.microsoft.com/office/word/2010/wordprocessingShape" mc:Ignorable="w14 w15 w16se w16cid w16 w16cex w16sdtdh w16sdtfl w16du wp14">
+<w:endnotes xmlns:wpc="http://schemas.microsoft.com/office/word/2010/wordprocessingCanvas" xmlns:cx="http://schemas.microsoft.com/office/drawing/2014/chartex" xmlns:cx1="http://schemas.microsoft.com/office/drawing/2015/9/8/chartex" xmlns:cx2="http://schemas.microsoft.com/office/drawing/2015/10/21/chartex" xmlns:cx3="http://schemas.microsoft.com/office/drawing/2016/5/9/chartex" xmlns:cx4="http://schemas.microsoft.com/office/drawing/2016/5/10/chartex" xmlns:cx5="http://schemas.microsoft.com/office/drawing/2016/5/11/chartex" xmlns:cx6="http://schemas.microsoft.com/office/drawing/2016/5/12/chartex" xmlns:cx7="http://schemas.microsoft.com/office/drawing/2016/5/13/chartex" xmlns:cx8="http://schemas.microsoft.com/office/drawing/2016/5/14/chartex" xmlns:mc="http://schemas.openxmlformats.org/markup-compatibility/2006" xmlns:aink="http://schemas.microsoft.com/office/drawing/2016/ink" xmlns:am3d="http://schemas.microsoft.com/office/drawing/2017/model3d" xmlns:o="urn:schemas-microsoft-com:office:office" xmlns:oel="http://schemas.microsoft.com/office/2019/extlst" xmlns:r="http://schemas.openxmlformats.org/officeDocument/2006/relationships" xmlns:m="http://schemas.openxmlformats.org/officeDocument/2006/math" xmlns:v="urn:schemas-microsoft-com:vml" xmlns:wp14="http://schemas.microsoft.com/office/word/2010/wordprocessingDrawing" xmlns:wp="http://schemas.openxmlformats.org/drawingml/2006/wordprocessingDrawing" xmlns:w10="urn:schemas-microsoft-com:office:word" xmlns:w="http://schemas.openxmlformats.org/wordprocessingml/2006/main" xmlns:w14="http://schemas.microsoft.com/office/word/2010/wordml" xmlns:w15="http://schemas.microsoft.com/office/word/2012/wordml" xmlns:w16cex="http://schemas.microsoft.com/office/word/2018/wordml/cex" xmlns:w16cid="http://schemas.microsoft.com/office/word/2016/wordml/cid" xmlns:w16="http://schemas.microsoft.com/office/word/2018/wordml" xmlns:w16du="http://schemas.microsoft.com/office/word/2023/wordml/word16du" xmlns:w16sdtdh="http://schemas.microsoft.com/office/word/2020/wordml/sdtdatahash" xmlns:w16sdtfl="http://schemas.microsoft.com/office/word/2024/wordml/sdtformatlock" xmlns:w16se="http://schemas.microsoft.com/office/word/2015/wordml/symex" xmlns:wpg="http://schemas.microsoft.com/office/word/2010/wordprocessingGroup" xmlns:wpi="http://schemas.microsoft.com/office/word/2010/wordprocessingInk" xmlns:wne="http://schemas.microsoft.com/office/word/2006/wordml" xmlns:wps="http://schemas.microsoft.com/office/word/2010/wordprocessingShape" mc:Ignorable="w14 w15 w16se w16cid w16 w16cex w16sdtdh w16sdtfl w16du wp14">
   <w:endnote w:type="separator" w:id="-1">
     <w:p>
       <w:pPr>
@@ -1130,7 +1193,7 @@
 </file>
 
 <file path=word/footer1.xml><?xml version="1.0" encoding="utf-8"?>
-<w:ftr xmlns:wpc="http://schemas.microsoft.com/office/word/2010/wordprocessingCanvas" xmlns:cx="http://schemas.microsoft.com/office/drawing/2014/chartex" xmlns:cx1="http://schemas.microsoft.com/office/drawing/2015/9/8/chartex" xmlns:cx2="http://schemas.microsoft.com/office/drawing/2015/10/21/chartex" xmlns:cx3="http://schemas.microsoft.com/office/drawing/2016/5/9/chartex" xmlns:cx4="http://schemas.microsoft.com/office/drawing/2016/5/10/chartex" xmlns:cx5="http://schemas.microsoft.com/office/drawing/2016/5/11/chartex" xmlns:cx6="http://schemas.microsoft.com/office/drawing/2016/5/12/chartex" xmlns:cx7="http://schemas.microsoft.com/office/drawing/2016/5/13/chartex" xmlns:cx8="http://schemas.microsoft.com/office/drawing/2016/5/14/chartex" xmlns:mc="http://schemas.openxmlformats.org/markup-compatibility/2006" xmlns:aink="http://schemas.microsoft.com/office/drawing/2016/ink" xmlns:am3d="http://schemas.microsoft.com/office/drawing/2017/model3d" xmlns:o="urn:schemas-microsoft-com:office:office" xmlns:oel="http://schemas.microsoft.com/office/2019/extlst" xmlns:r="http://schemas.openxmlformats.org/officeDocument/2006/relationships" xmlns:m="http://schemas.openxmlformats.org/officeDocument/2006/math" xmlns:v="urn:schemas-microsoft-com:vml" xmlns:wp14="http://schemas.microsoft.com/office/word/2010/wordprocessingDrawing" xmlns:wp="http://schemas.openxmlformats.org/drawingml/2006/wordprocessingDrawing" xmlns:w10="urn:schemas-microsoft-com:office:word" xmlns:w="http://schemas.openxmlformats.org/wordprocessingml/2006/main" xmlns:w14="http://schemas.microsoft.com/office/word/2010/wordml" xmlns:w15="http://schemas.microsoft.com/office/word/2012/wordml" xmlns:w16cei="http://schemas.microsoft.com/office/word/2026/wordml/cei" xmlns:w16cex="http://schemas.microsoft.com/office/word/2018/wordml/cex" xmlns:w16cid="http://schemas.microsoft.com/office/word/2016/wordml/cid" xmlns:w16="http://schemas.microsoft.com/office/word/2018/wordml" xmlns:w16du="http://schemas.microsoft.com/office/word/2023/wordml/word16du" xmlns:w16sdtdh="http://schemas.microsoft.com/office/word/2020/wordml/sdtdatahash" xmlns:w16sdtfl="http://schemas.microsoft.com/office/word/2024/wordml/sdtformatlock" xmlns:w16se="http://schemas.microsoft.com/office/word/2015/wordml/symex" xmlns:wpg="http://schemas.microsoft.com/office/word/2010/wordprocessingGroup" xmlns:wpi="http://schemas.microsoft.com/office/word/2010/wordprocessingInk" xmlns:wne="http://schemas.microsoft.com/office/word/2006/wordml" xmlns:wps="http://schemas.microsoft.com/office/word/2010/wordprocessingShape" mc:Ignorable="w14 w15 w16se w16cid w16 w16cex w16sdtdh w16sdtfl w16du wp14">
+<w:ftr xmlns:wpc="http://schemas.microsoft.com/office/word/2010/wordprocessingCanvas" xmlns:cx="http://schemas.microsoft.com/office/drawing/2014/chartex" xmlns:cx1="http://schemas.microsoft.com/office/drawing/2015/9/8/chartex" xmlns:cx2="http://schemas.microsoft.com/office/drawing/2015/10/21/chartex" xmlns:cx3="http://schemas.microsoft.com/office/drawing/2016/5/9/chartex" xmlns:cx4="http://schemas.microsoft.com/office/drawing/2016/5/10/chartex" xmlns:cx5="http://schemas.microsoft.com/office/drawing/2016/5/11/chartex" xmlns:cx6="http://schemas.microsoft.com/office/drawing/2016/5/12/chartex" xmlns:cx7="http://schemas.microsoft.com/office/drawing/2016/5/13/chartex" xmlns:cx8="http://schemas.microsoft.com/office/drawing/2016/5/14/chartex" xmlns:mc="http://schemas.openxmlformats.org/markup-compatibility/2006" xmlns:aink="http://schemas.microsoft.com/office/drawing/2016/ink" xmlns:am3d="http://schemas.microsoft.com/office/drawing/2017/model3d" xmlns:o="urn:schemas-microsoft-com:office:office" xmlns:oel="http://schemas.microsoft.com/office/2019/extlst" xmlns:r="http://schemas.openxmlformats.org/officeDocument/2006/relationships" xmlns:m="http://schemas.openxmlformats.org/officeDocument/2006/math" xmlns:v="urn:schemas-microsoft-com:vml" xmlns:wp14="http://schemas.microsoft.com/office/word/2010/wordprocessingDrawing" xmlns:wp="http://schemas.openxmlformats.org/drawingml/2006/wordprocessingDrawing" xmlns:w10="urn:schemas-microsoft-com:office:word" xmlns:w="http://schemas.openxmlformats.org/wordprocessingml/2006/main" xmlns:w14="http://schemas.microsoft.com/office/word/2010/wordml" xmlns:w15="http://schemas.microsoft.com/office/word/2012/wordml" xmlns:w16cex="http://schemas.microsoft.com/office/word/2018/wordml/cex" xmlns:w16cid="http://schemas.microsoft.com/office/word/2016/wordml/cid" xmlns:w16="http://schemas.microsoft.com/office/word/2018/wordml" xmlns:w16du="http://schemas.microsoft.com/office/word/2023/wordml/word16du" xmlns:w16sdtdh="http://schemas.microsoft.com/office/word/2020/wordml/sdtdatahash" xmlns:w16sdtfl="http://schemas.microsoft.com/office/word/2024/wordml/sdtformatlock" xmlns:w16se="http://schemas.microsoft.com/office/word/2015/wordml/symex" xmlns:wpg="http://schemas.microsoft.com/office/word/2010/wordprocessingGroup" xmlns:wpi="http://schemas.microsoft.com/office/word/2010/wordprocessingInk" xmlns:wne="http://schemas.microsoft.com/office/word/2006/wordml" xmlns:wps="http://schemas.microsoft.com/office/word/2010/wordprocessingShape" mc:Ignorable="w14 w15 w16se w16cid w16 w16cex w16sdtdh w16sdtfl w16du wp14">
   <w:p>
     <w:pPr>
       <w:pStyle w:val="Footer"/>
@@ -1166,7 +1229,7 @@
 </file>
 
 <file path=word/footnotes.xml><?xml version="1.0" encoding="utf-8"?>
-<w:footnotes xmlns:wpc="http://schemas.microsoft.com/office/word/2010/wordprocessingCanvas" xmlns:cx="http://schemas.microsoft.com/office/drawing/2014/chartex" xmlns:cx1="http://schemas.microsoft.com/office/drawing/2015/9/8/chartex" xmlns:cx2="http://schemas.microsoft.com/office/drawing/2015/10/21/chartex" xmlns:cx3="http://schemas.microsoft.com/office/drawing/2016/5/9/chartex" xmlns:cx4="http://schemas.microsoft.com/office/drawing/2016/5/10/chartex" xmlns:cx5="http://schemas.microsoft.com/office/drawing/2016/5/11/chartex" xmlns:cx6="http://schemas.microsoft.com/office/drawing/2016/5/12/chartex" xmlns:cx7="http://schemas.microsoft.com/office/drawing/2016/5/13/chartex" xmlns:cx8="http://schemas.microsoft.com/office/drawing/2016/5/14/chartex" xmlns:mc="http://schemas.openxmlformats.org/markup-compatibility/2006" xmlns:aink="http://schemas.microsoft.com/office/drawing/2016/ink" xmlns:am3d="http://schemas.microsoft.com/office/drawing/2017/model3d" xmlns:o="urn:schemas-microsoft-com:office:office" xmlns:oel="http://schemas.microsoft.com/office/2019/extlst" xmlns:r="http://schemas.openxmlformats.org/officeDocument/2006/relationships" xmlns:m="http://schemas.openxmlformats.org/officeDocument/2006/math" xmlns:v="urn:schemas-microsoft-com:vml" xmlns:wp14="http://schemas.microsoft.com/office/word/2010/wordprocessingDrawing" xmlns:wp="http://schemas.openxmlformats.org/drawingml/2006/wordprocessingDrawing" xmlns:w10="urn:schemas-microsoft-com:office:word" xmlns:w="http://schemas.openxmlformats.org/wordprocessingml/2006/main" xmlns:w14="http://schemas.microsoft.com/office/word/2010/wordml" xmlns:w15="http://schemas.microsoft.com/office/word/2012/wordml" xmlns:w16cei="http://schemas.microsoft.com/office/word/2026/wordml/cei" xmlns:w16cex="http://schemas.microsoft.com/office/word/2018/wordml/cex" xmlns:w16cid="http://schemas.microsoft.com/office/word/2016/wordml/cid" xmlns:w16="http://schemas.microsoft.com/office/word/2018/wordml" xmlns:w16du="http://schemas.microsoft.com/office/word/2023/wordml/word16du" xmlns:w16sdtdh="http://schemas.microsoft.com/office/word/2020/wordml/sdtdatahash" xmlns:w16sdtfl="http://schemas.microsoft.com/office/word/2024/wordml/sdtformatlock" xmlns:w16se="http://schemas.microsoft.com/office/word/2015/wordml/symex" xmlns:wpg="http://schemas.microsoft.com/office/word/2010/wordprocessingGroup" xmlns:wpi="http://schemas.microsoft.com/office/word/2010/wordprocessingInk" xmlns:wne="http://schemas.microsoft.com/office/word/2006/wordml" xmlns:wps="http://schemas.microsoft.com/office/word/2010/wordprocessingShape" mc:Ignorable="w14 w15 w16se w16cid w16 w16cex w16sdtdh w16sdtfl w16du wp14">
+<w:footnotes xmlns:wpc="http://schemas.microsoft.com/office/word/2010/wordprocessingCanvas" xmlns:cx="http://schemas.microsoft.com/office/drawing/2014/chartex" xmlns:cx1="http://schemas.microsoft.com/office/drawing/2015/9/8/chartex" xmlns:cx2="http://schemas.microsoft.com/office/drawing/2015/10/21/chartex" xmlns:cx3="http://schemas.microsoft.com/office/drawing/2016/5/9/chartex" xmlns:cx4="http://schemas.microsoft.com/office/drawing/2016/5/10/chartex" xmlns:cx5="http://schemas.microsoft.com/office/drawing/2016/5/11/chartex" xmlns:cx6="http://schemas.microsoft.com/office/drawing/2016/5/12/chartex" xmlns:cx7="http://schemas.microsoft.com/office/drawing/2016/5/13/chartex" xmlns:cx8="http://schemas.microsoft.com/office/drawing/2016/5/14/chartex" xmlns:mc="http://schemas.openxmlformats.org/markup-compatibility/2006" xmlns:aink="http://schemas.microsoft.com/office/drawing/2016/ink" xmlns:am3d="http://schemas.microsoft.com/office/drawing/2017/model3d" xmlns:o="urn:schemas-microsoft-com:office:office" xmlns:oel="http://schemas.microsoft.com/office/2019/extlst" xmlns:r="http://schemas.openxmlformats.org/officeDocument/2006/relationships" xmlns:m="http://schemas.openxmlformats.org/officeDocument/2006/math" xmlns:v="urn:schemas-microsoft-com:vml" xmlns:wp14="http://schemas.microsoft.com/office/word/2010/wordprocessingDrawing" xmlns:wp="http://schemas.openxmlformats.org/drawingml/2006/wordprocessingDrawing" xmlns:w10="urn:schemas-microsoft-com:office:word" xmlns:w="http://schemas.openxmlformats.org/wordprocessingml/2006/main" xmlns:w14="http://schemas.microsoft.com/office/word/2010/wordml" xmlns:w15="http://schemas.microsoft.com/office/word/2012/wordml" xmlns:w16cex="http://schemas.microsoft.com/office/word/2018/wordml/cex" xmlns:w16cid="http://schemas.microsoft.com/office/word/2016/wordml/cid" xmlns:w16="http://schemas.microsoft.com/office/word/2018/wordml" xmlns:w16du="http://schemas.microsoft.com/office/word/2023/wordml/word16du" xmlns:w16sdtdh="http://schemas.microsoft.com/office/word/2020/wordml/sdtdatahash" xmlns:w16sdtfl="http://schemas.microsoft.com/office/word/2024/wordml/sdtformatlock" xmlns:w16se="http://schemas.microsoft.com/office/word/2015/wordml/symex" xmlns:wpg="http://schemas.microsoft.com/office/word/2010/wordprocessingGroup" xmlns:wpi="http://schemas.microsoft.com/office/word/2010/wordprocessingInk" xmlns:wne="http://schemas.microsoft.com/office/word/2006/wordml" xmlns:wps="http://schemas.microsoft.com/office/word/2010/wordprocessingShape" mc:Ignorable="w14 w15 w16se w16cid w16 w16cex w16sdtdh w16sdtfl w16du wp14">
   <w:footnote w:type="separator" w:id="-1">
     <w:p>
       <w:pPr>
@@ -1191,7 +1254,7 @@
 </file>
 
 <file path=word/numbering.xml><?xml version="1.0" encoding="utf-8"?>
-<w:numbering xmlns:wpc="http://schemas.microsoft.com/office/word/2010/wordprocessingCanvas" xmlns:cx="http://schemas.microsoft.com/office/drawing/2014/chartex" xmlns:cx1="http://schemas.microsoft.com/office/drawing/2015/9/8/chartex" xmlns:cx2="http://schemas.microsoft.com/office/drawing/2015/10/21/chartex" xmlns:cx3="http://schemas.microsoft.com/office/drawing/2016/5/9/chartex" xmlns:cx4="http://schemas.microsoft.com/office/drawing/2016/5/10/chartex" xmlns:cx5="http://schemas.microsoft.com/office/drawing/2016/5/11/chartex" xmlns:cx6="http://schemas.microsoft.com/office/drawing/2016/5/12/chartex" xmlns:cx7="http://schemas.microsoft.com/office/drawing/2016/5/13/chartex" xmlns:cx8="http://schemas.microsoft.com/office/drawing/2016/5/14/chartex" xmlns:mc="http://schemas.openxmlformats.org/markup-compatibility/2006" xmlns:aink="http://schemas.microsoft.com/office/drawing/2016/ink" xmlns:am3d="http://schemas.microsoft.com/office/drawing/2017/model3d" xmlns:o="urn:schemas-microsoft-com:office:office" xmlns:oel="http://schemas.microsoft.com/office/2019/extlst" xmlns:r="http://schemas.openxmlformats.org/officeDocument/2006/relationships" xmlns:m="http://schemas.openxmlformats.org/officeDocument/2006/math" xmlns:v="urn:schemas-microsoft-com:vml" xmlns:wp14="http://schemas.microsoft.com/office/word/2010/wordprocessingDrawing" xmlns:wp="http://schemas.openxmlformats.org/drawingml/2006/wordprocessingDrawing" xmlns:w10="urn:schemas-microsoft-com:office:word" xmlns:w="http://schemas.openxmlformats.org/wordprocessingml/2006/main" xmlns:w14="http://schemas.microsoft.com/office/word/2010/wordml" xmlns:w15="http://schemas.microsoft.com/office/word/2012/wordml" xmlns:w16cei="http://schemas.microsoft.com/office/word/2026/wordml/cei" xmlns:w16cex="http://schemas.microsoft.com/office/word/2018/wordml/cex" xmlns:w16cid="http://schemas.microsoft.com/office/word/2016/wordml/cid" xmlns:w16="http://schemas.microsoft.com/office/word/2018/wordml" xmlns:w16du="http://schemas.microsoft.com/office/word/2023/wordml/word16du" xmlns:w16sdtdh="http://schemas.microsoft.com/office/word/2020/wordml/sdtdatahash" xmlns:w16sdtfl="http://schemas.microsoft.com/office/word/2024/wordml/sdtformatlock" xmlns:w16se="http://schemas.microsoft.com/office/word/2015/wordml/symex" xmlns:wpg="http://schemas.microsoft.com/office/word/2010/wordprocessingGroup" xmlns:wpi="http://schemas.microsoft.com/office/word/2010/wordprocessingInk" xmlns:wne="http://schemas.microsoft.com/office/word/2006/wordml" xmlns:wps="http://schemas.microsoft.com/office/word/2010/wordprocessingShape" mc:Ignorable="w14 w15 w16se w16cid w16 w16cex w16sdtdh w16sdtfl w16du wp14">
+<w:numbering xmlns:wpc="http://schemas.microsoft.com/office/word/2010/wordprocessingCanvas" xmlns:cx="http://schemas.microsoft.com/office/drawing/2014/chartex" xmlns:cx1="http://schemas.microsoft.com/office/drawing/2015/9/8/chartex" xmlns:cx2="http://schemas.microsoft.com/office/drawing/2015/10/21/chartex" xmlns:cx3="http://schemas.microsoft.com/office/drawing/2016/5/9/chartex" xmlns:cx4="http://schemas.microsoft.com/office/drawing/2016/5/10/chartex" xmlns:cx5="http://schemas.microsoft.com/office/drawing/2016/5/11/chartex" xmlns:cx6="http://schemas.microsoft.com/office/drawing/2016/5/12/chartex" xmlns:cx7="http://schemas.microsoft.com/office/drawing/2016/5/13/chartex" xmlns:cx8="http://schemas.microsoft.com/office/drawing/2016/5/14/chartex" xmlns:mc="http://schemas.openxmlformats.org/markup-compatibility/2006" xmlns:aink="http://schemas.microsoft.com/office/drawing/2016/ink" xmlns:am3d="http://schemas.microsoft.com/office/drawing/2017/model3d" xmlns:o="urn:schemas-microsoft-com:office:office" xmlns:oel="http://schemas.microsoft.com/office/2019/extlst" xmlns:r="http://schemas.openxmlformats.org/officeDocument/2006/relationships" xmlns:m="http://schemas.openxmlformats.org/officeDocument/2006/math" xmlns:v="urn:schemas-microsoft-com:vml" xmlns:wp14="http://schemas.microsoft.com/office/word/2010/wordprocessingDrawing" xmlns:wp="http://schemas.openxmlformats.org/drawingml/2006/wordprocessingDrawing" xmlns:w10="urn:schemas-microsoft-com:office:word" xmlns:w="http://schemas.openxmlformats.org/wordprocessingml/2006/main" xmlns:w14="http://schemas.microsoft.com/office/word/2010/wordml" xmlns:w15="http://schemas.microsoft.com/office/word/2012/wordml" xmlns:w16cex="http://schemas.microsoft.com/office/word/2018/wordml/cex" xmlns:w16cid="http://schemas.microsoft.com/office/word/2016/wordml/cid" xmlns:w16="http://schemas.microsoft.com/office/word/2018/wordml" xmlns:w16du="http://schemas.microsoft.com/office/word/2023/wordml/word16du" xmlns:w16sdtdh="http://schemas.microsoft.com/office/word/2020/wordml/sdtdatahash" xmlns:w16sdtfl="http://schemas.microsoft.com/office/word/2024/wordml/sdtformatlock" xmlns:w16se="http://schemas.microsoft.com/office/word/2015/wordml/symex" xmlns:wpg="http://schemas.microsoft.com/office/word/2010/wordprocessingGroup" xmlns:wpi="http://schemas.microsoft.com/office/word/2010/wordprocessingInk" xmlns:wne="http://schemas.microsoft.com/office/word/2006/wordml" xmlns:wps="http://schemas.microsoft.com/office/word/2010/wordprocessingShape" mc:Ignorable="w14 w15 w16se w16cid w16 w16cex w16sdtdh w16sdtfl w16du wp14">
   <w:abstractNum w:abstractNumId="0" w15:restartNumberingAfterBreak="0">
     <w:nsid w:val="FFFFFF7C"/>
     <w:multiLevelType w:val="singleLevel"/>

</xml_diff>

<commit_message>
Sharpen 3D polygon shadow/lighting and push updated CV document
</commit_message>
<xml_diff>
--- a/public/Aniruddh Paralikar - AI Transformation CoE.docx
+++ b/public/Aniruddh Paralikar - AI Transformation CoE.docx
@@ -42,30 +42,6 @@
           <w:color w:val="525252"/>
           <w:sz w:val="17"/>
         </w:rPr>
-        <w:t xml:space="preserve">Hyderabad, </w:t>
-      </w:r>
-      <w:proofErr w:type="gramStart"/>
-      <w:r>
-        <w:rPr>
-          <w:color w:val="525252"/>
-          <w:sz w:val="17"/>
-        </w:rPr>
-        <w:t>India  |</w:t>
-      </w:r>
-      <w:proofErr w:type="gramEnd"/>
-      <w:r>
-        <w:rPr>
-          <w:color w:val="525252"/>
-          <w:sz w:val="17"/>
-        </w:rPr>
-        <w:t xml:space="preserve">  </w:t>
-      </w:r>
-      <w:proofErr w:type="gramStart"/>
-      <w:r>
-        <w:rPr>
-          <w:color w:val="525252"/>
-          <w:sz w:val="17"/>
-        </w:rPr>
         <w:t>connectwithaniruddh</w:t>
       </w:r>
       <w:r>
@@ -87,15 +63,7 @@
           <w:color w:val="525252"/>
           <w:sz w:val="17"/>
         </w:rPr>
-        <w:t xml:space="preserve">  |</w:t>
-      </w:r>
-      <w:proofErr w:type="gramEnd"/>
-      <w:r>
-        <w:rPr>
-          <w:color w:val="525252"/>
-          <w:sz w:val="17"/>
-        </w:rPr>
-        <w:t xml:space="preserve">  linkedin.com/in/aniruddhparalikar</w:t>
+        <w:t xml:space="preserve">  |  linkedin.com/in/aniruddhparalikar</w:t>
       </w:r>
     </w:p>
     <w:p>
@@ -418,21 +386,7 @@
         <w:rPr>
           <w:color w:val="000000"/>
         </w:rPr>
-        <w:t xml:space="preserve">Python, </w:t>
-      </w:r>
-      <w:proofErr w:type="spellStart"/>
-      <w:r>
-        <w:rPr>
-          <w:color w:val="000000"/>
-        </w:rPr>
-        <w:t>FastAPI</w:t>
-      </w:r>
-      <w:proofErr w:type="spellEnd"/>
-      <w:r>
-        <w:rPr>
-          <w:color w:val="000000"/>
-        </w:rPr>
-        <w:t>, REST/SOAP APIs, Microsoft Fabric, Salesforce, ServiceNow, Power Automate, UiPath, Ansible, Terraform, SQL Server, SSIS</w:t>
+        <w:t>Python, FastAPI, REST/SOAP APIs, Microsoft Fabric, Salesforce, ServiceNow, Power Automate, UiPath, Ansible, Terraform, SQL Server, SSIS</w:t>
       </w:r>
     </w:p>
     <w:p>
@@ -460,7 +414,6 @@
         </w:tabs>
         <w:spacing w:before="100"/>
       </w:pPr>
-      <w:proofErr w:type="spellStart"/>
       <w:r>
         <w:rPr>
           <w:b/>
@@ -477,7 +430,6 @@
         </w:rPr>
         <w:t>lliantgroup</w:t>
       </w:r>
-      <w:proofErr w:type="spellEnd"/>
       <w:r>
         <w:t xml:space="preserve"> | </w:t>
       </w:r>
@@ -532,21 +484,7 @@
         <w:rPr>
           <w:color w:val="000000"/>
         </w:rPr>
-        <w:t xml:space="preserve">Lead the AI &amp; Data CoE, defining enterprise AI strategy, governance, operating </w:t>
-      </w:r>
-      <w:proofErr w:type="gramStart"/>
-      <w:r>
-        <w:rPr>
-          <w:color w:val="000000"/>
-        </w:rPr>
-        <w:t>model</w:t>
-      </w:r>
-      <w:proofErr w:type="gramEnd"/>
-      <w:r>
-        <w:rPr>
-          <w:color w:val="000000"/>
-        </w:rPr>
-        <w:t>, architecture standards, reusable assets, and adoption playbooks aligned with transformation priorities.</w:t>
+        <w:t>Lead the AI &amp; Data CoE, defining enterprise AI strategy, governance, operating model, architecture standards, reusable assets, and adoption playbooks aligned with transformation priorities.</w:t>
       </w:r>
     </w:p>
     <w:p>
@@ -570,21 +508,7 @@
         <w:rPr>
           <w:color w:val="000000"/>
         </w:rPr>
-        <w:t xml:space="preserve">Direct transformation </w:t>
-      </w:r>
-      <w:proofErr w:type="gramStart"/>
-      <w:r>
-        <w:rPr>
-          <w:color w:val="000000"/>
-        </w:rPr>
-        <w:t>use</w:t>
-      </w:r>
-      <w:proofErr w:type="gramEnd"/>
-      <w:r>
-        <w:rPr>
-          <w:color w:val="000000"/>
-        </w:rPr>
-        <w:t xml:space="preserve"> cases across audit, FP&amp;A, O2C, P2P, and R2R, including invoice and vendor validation, terms recognition, tax and cover-sheet preparation, anomaly detection, and time-sheet integration.</w:t>
+        <w:t>Direct transformation use cases across audit, FP&amp;A, O2C, P2P, and R2R, including invoice and vendor validation, terms recognition, tax and cover-sheet preparation, anomaly detection, and time-sheet integration.</w:t>
       </w:r>
     </w:p>
     <w:p>

</xml_diff>